<commit_message>
docs: fully update devis with all 42 sections and agreed specifications
</commit_message>
<xml_diff>
--- a/DEVIS_HAUSMAN_BIAOU_Marius.docx
+++ b/DEVIS_HAUSMAN_BIAOU_Marius.docx
@@ -224,7 +224,7 @@
         <w:spacing w:after="200" w:line="276" w:lineRule="auto"/>
       </w:pPr>
       <w:r>
-        <w:t>Conception et développement du site HAUSMAN : un showroom digital de mode présentant le catalogue de location de vêtements, accessoires et pièces designer / archive, ainsi que les projets réalisés (éditoriaux, campagnes, collaborations). Le site fonctionne comme une vitrine et une galerie; il ne comporte aucune fonctionnalité e-commerce (pas de panier, pas de paiement en ligne, pas de réservation automatique).</w:t>
+        <w:t>Conception et développement du site HAUSMAN : un showroom digital de mode et catalogue de vestiaire d'archives basé à Paris, présentant une sélection curatée de pièces designer, archive et contemporaines destinées aux stylistes, artistes, productions, photographes, magazines et projets créatifs. Le site fonctionne comme une vitrine confidentielle et une galerie éditoriale; il ne comporte aucune fonctionnalité e-commerce (pas de panier, pas de prix publics, pas de pastilles de statut visibles, pas de paiement en ligne, pas de réservation automatique).</w:t>
       </w:r>
     </w:p>
     <w:p>
@@ -258,13 +258,13 @@
           <w:b/>
           <w:sz w:val="18"/>
         </w:rPr>
-        <w:t xml:space="preserve">• Framework &amp; Front-end : </w:t>
+        <w:t xml:space="preserve">• Architecture Front-end Sur-Mesure : </w:t>
       </w:r>
       <w:r>
         <w:rPr>
           <w:sz w:val="18"/>
         </w:rPr>
-        <w:t>Front-end sur-mesure ultra-léger (HTML5, CSS3, Vanilla JS) avec architecture Laravel (PHP) et Blade pour un rendu serveur natif, ultra-fluide, garantissant un temps de chargement instantané (&lt; 0.3s) et un référencement naturel (SEO) optimal.</w:t>
+        <w:t>Développement sur-mesure ultra-léger (HTML5, CSS3, Modern Vanilla JS) avec architecture Laravel (PHP 8+) et Blade pour un rendu serveur natif, ultra-fluide, garantissant un temps de chargement instantané (&lt; 0.3s) et un référencement naturel (SEO) optimal.</w:t>
       </w:r>
     </w:p>
     <w:p>
@@ -277,13 +277,13 @@
           <w:b/>
           <w:sz w:val="18"/>
         </w:rPr>
-        <w:t xml:space="preserve">• Base de données : </w:t>
+        <w:t xml:space="preserve">• Base de données &amp; Gestion des Archives : </w:t>
       </w:r>
       <w:r>
         <w:rPr>
           <w:sz w:val="18"/>
         </w:rPr>
-        <w:t>MySQL.</w:t>
+        <w:t>MySQL avec structuration des pièces, des photographies haute définition au ratio 4:5 et des projets.</w:t>
       </w:r>
     </w:p>
     <w:p>
@@ -302,7 +302,7 @@
         <w:rPr>
           <w:sz w:val="18"/>
         </w:rPr>
-        <w:t>ajout, modification, masquage des vêtements (avec auto-référence HSMN-xxx et 4 statuts privés), upload des 5 photos par pièce et gestion des projets, sans aucune intervention du développeur.</w:t>
+        <w:t>Interface privée permettant l'ajout, la modification, le masquage des vêtements avec génération automatique des références au format strict HSMN-xxx (HSMN-001, HSMN-002...), gestion des 4 statuts privés (Available, Reserved, On Loan, Unavailable), upload de la série de 5 photos HD par pièce et gestion des projets éditoriaux, sans aucune intervention du développeur.</w:t>
       </w:r>
     </w:p>
     <w:p>
@@ -315,13 +315,13 @@
           <w:b/>
           <w:sz w:val="18"/>
         </w:rPr>
-        <w:t xml:space="preserve">• Hébergement : </w:t>
+        <w:t xml:space="preserve">• Hébergement &amp; Déploiement : </w:t>
       </w:r>
       <w:r>
         <w:rPr>
           <w:sz w:val="18"/>
         </w:rPr>
-        <w:t>OVH (mutualisé ou VPS selon le volume de trafic et de stockage).</w:t>
+        <w:t>OVH (mutualisé ou VPS selon le volume de trafic et de stockage) ou Cloudflare Pages / CDN Edge pour des performances mondiales optimales.</w:t>
       </w:r>
     </w:p>
     <w:p>
@@ -340,7 +340,7 @@
         <w:rPr>
           <w:sz w:val="18"/>
         </w:rPr>
-        <w:t>Compte d'hébergement OVH et nom de domaine créés au nom de HAUSMAN, avec transfert complet des accès à la livraison.</w:t>
+        <w:t>Compte d'hébergement OVH et nom de domaine créés au nom de HAUSMAN, avec transfert complet des accès et cession totale de la propriété intellectuelle du code à la livraison.</w:t>
       </w:r>
     </w:p>
     <w:p>
@@ -348,7 +348,7 @@
         <w:spacing w:before="80" w:after="200" w:line="276" w:lineRule="auto"/>
       </w:pPr>
       <w:r>
-        <w:t>Cette stack permet d'obtenir un résultat visuel et fonctionnel équivalent à une solution type Webflow, avec une interface d'administration entièrement adaptée aux besoins spécifiques de HAUSMAN (fiches vêtements multi-photos, catégories, filtres). L'ensemble (code, hébergement, données) reste hébergé en France chez OVH, et la propriété du site est entièrement transférée à HAUSMAN.</w:t>
+        <w:t>Cette stack permet d'obtenir un résultat visuel et fonctionnel d'une pureté absolue, sans aucune contrainte de template rigide WordPress, avec une interface d'administration entièrement adaptée aux besoins spécifiques de HAUSMAN (fiches vêtements à 5 photos HD, 9 catégories officielles, statuts confidentiels, filtres overlay). L'ensemble (code source, hébergement, base de données) reste hébergé en France chez OVH, et la propriété intégrale du site est transférée à HAUSMAN.</w:t>
       </w:r>
     </w:p>
     <w:p>
@@ -393,7 +393,7 @@
         <w:rPr>
           <w:sz w:val="18"/>
         </w:rPr>
-        <w:t>• Home / Intro - animation flash de 20-30 pièces d'archives (~2.0s) puis transition fluide vers le Menu central</w:t>
+        <w:t>• Home / Intro : animation flash avant-gardiste de 25 pièces et silhouettes d'archives détourées (~80ms par image, durée 2.0s pile) avec fondu automatique doux vers le Menu d'accueil (possibilité de clic pour skip)</w:t>
       </w:r>
     </w:p>
     <w:p>
@@ -405,7 +405,7 @@
         <w:rPr>
           <w:sz w:val="18"/>
         </w:rPr>
-        <w:t>• Menu d'accueil - logo fixe, 4 liens majeurs épurés (COLLECTION, PROJECTS, ABOUT, CONTACT), footer discret</w:t>
+        <w:t>• Menu d'accueil (Accueil = Menu) : logo HAUSMAN fixe en haut, 4 liens majeurs épurés (COLLECTION, PROJECTS, ABOUT, CONTACT), pied de page minimaliste. Interaction logo : clic sur HAUSMAN depuis le Menu relance l'intro animée ; depuis les autres pages, il ramène au Menu</w:t>
       </w:r>
     </w:p>
     <w:p>
@@ -417,7 +417,7 @@
         <w:rPr>
           <w:sz w:val="18"/>
         </w:rPr>
-        <w:t>• Collection - catalogue filtrable au ratio 4:5 (marque, catégories), survol révélant la silhouette portée mannequin, overlay filtres et recherche loupe par référence (HSMN-xxx)</w:t>
+        <w:t>• Collection : catalogue pur au ratio strict 4:5 (3 à 4 colonnes sur desktop, 1 colonne stricte sur smartphone), affichant uniquement la photo et le nom de la marque. Survol desktop fluide révélant la silhouette portée par le mannequin (on-model), tap mobile ouvrant directement la fiche</w:t>
       </w:r>
     </w:p>
     <w:p>
@@ -429,7 +429,7 @@
         <w:rPr>
           <w:sz w:val="18"/>
         </w:rPr>
-        <w:t>• Fiche vêtement - galerie de 5 photos haute définition (plat face, dos, détail, porté face, silhouette), informations sobres (marque, nom, catégorie, taille, mensurations mannequin), mention discrète "Rental upon request"</w:t>
+        <w:t>• Filtres &amp; Recherche Collection : bouton discret FILTER ouvrant un calque blanc semi-transparent avec liste alphabétique des créateurs (DESIGNER) et des 9 catégories officielles (OUTERWEAR, TOPS, BOTTOMS, DRESSES, TAILORING, LEATHER, SHOES, ACCESSORIES, OBJECTS). Recherche loupe ultra-rapide par marque ou référence stricte (HSMN-xxx)</w:t>
       </w:r>
     </w:p>
     <w:p>
@@ -441,7 +441,7 @@
         <w:rPr>
           <w:sz w:val="18"/>
         </w:rPr>
-        <w:t>• Projects - portfolio 4:5 avec titre, année, publication, crédits détaillés, défilement horizontal fluide des visuels et bouton NEXT PROJECT →</w:t>
+        <w:t>• Fiche vêtement : galerie de strictement 5 photographies haute définition au ratio 4:5 (1. Plat face, 2. Plat dos, 3. Détail/3-quarts, 4. Porté face, 5. Porté silhouette). Lightbox plein écran avec zoom et navigation tactile/clavier. Fiche technique épurée avec mensurations du mannequin et mention texte simple 'Rental upon request' pré-remplissant la demande de contact</w:t>
       </w:r>
     </w:p>
     <w:p>
@@ -453,7 +453,7 @@
         <w:rPr>
           <w:sz w:val="18"/>
         </w:rPr>
-        <w:t>• About - page courte et épurée présentant HAUSMAN comme entité indépendante de curation</w:t>
+        <w:t>• Projects (HAUSMAN Files) : portfolio au ratio 4:5 avec filtres par catégorie (ALL, HAUSMAN FILES, ARTISTS, EDITORIALS, CAMPAIGNS). Fiche projet détaillée avec défilement horizontal fluide des visuels paysage, tableau complet des crédits (Stylisme, Photo, Mannequin, Pièces d'archives utilisées) et bouton NEXT PROJECT →</w:t>
       </w:r>
     </w:p>
     <w:p>
@@ -465,7 +465,7 @@
         <w:rPr>
           <w:sz w:val="18"/>
         </w:rPr>
-        <w:t>• Contact - formulaire structuré typographique (nom, email/Instagram, type de projet, dates, pièces demandées, message) + anti-spam invisible et liens directs WhatsApp, Instagram, Email</w:t>
+        <w:t>• About : page courte et épurée présentant HAUSMAN comme entité indépendante de curation et d'archives de mode à Paris</w:t>
       </w:r>
     </w:p>
     <w:p>
@@ -477,7 +477,19 @@
         <w:rPr>
           <w:sz w:val="18"/>
         </w:rPr>
-        <w:t>• Design : direction artistique minimaliste, silencieuse, inspirée galerie/mode (fond blanc pur, grands espaces, typographie sobre, 0 bruit)</w:t>
+        <w:t>• Contact : formulaire structuré typographique (Nom, Marque/Agence, Email, Dates de prêt, Pièces demandées pré-remplies, Message), protection anti-spam invisible (honeypot sans captcha intrusif), confirmation instantanée sans rechargement, et liens directs WhatsApp, Instagram, Email</w:t>
+      </w:r>
+    </w:p>
+    <w:p>
+      <w:pPr>
+        <w:spacing w:after="40"/>
+        <w:ind w:left="283"/>
+      </w:pPr>
+      <w:r>
+        <w:rPr>
+          <w:sz w:val="18"/>
+        </w:rPr>
+        <w:t>• Design &amp; Esthétique : direction artistique silencieuse, minimale, galerie/mode (fond blanc pur #FFFFFF, grands espaces de respiration, typographie noire sobre, zéro bruit visuel, suppression totale des badges et codes e-commerce)</w:t>
       </w:r>
     </w:p>
     <w:p>
@@ -501,7 +513,7 @@
         <w:rPr>
           <w:sz w:val="18"/>
         </w:rPr>
-        <w:t>• Responsive mobile-first (1 colonne stricte sur smartphone pour une pureté visuelle absolue)</w:t>
+        <w:t>• Responsive mobile-first (1 colonne stricte sur smartphone pour une lisibilité et un impact visuel absolus)</w:t>
       </w:r>
     </w:p>
     <w:p>
@@ -513,7 +525,7 @@
         <w:rPr>
           <w:sz w:val="18"/>
         </w:rPr>
-        <w:t>• Panel d'administration sur-mesure pour gérer vêtements (auto-référence HSMN-xxx, 4 statuts privés) et projets en totale autonomie</w:t>
+        <w:t>• Panel d'administration sur-mesure : gestion complète des vêtements (génération auto des références HSMN-xxx, 4 statuts confidentiels Available/Reserved/On Loan/Unavailable, upload 5 vues WebP), gestion des projets et suivi des demandes de pull des stylistes</w:t>
       </w:r>
     </w:p>
     <w:p>
@@ -525,7 +537,7 @@
         <w:rPr>
           <w:sz w:val="18"/>
         </w:rPr>
-        <w:t>• Bases SEO : titres, meta-descriptions, URLs propres, balises Open Graph (partage Instagram/iMessage/WhatsApp), indexation</w:t>
+        <w:t>• Bases SEO : titres, meta-descriptions, URLs propres, balises Open Graph (affichage enrichi lors des partages sur Instagram, WhatsApp, iMessage, LinkedIn), indexation</w:t>
       </w:r>
     </w:p>
     <w:p>
@@ -537,7 +549,7 @@
         <w:rPr>
           <w:sz w:val="18"/>
         </w:rPr>
-        <w:t>• Favicon, page 404 sur-mesure et pages légales de base (mentions légales / politique de confidentialité)</w:t>
+        <w:t>• Favicon, page 404 sur-mesure ('Page Not Found / Return to Menu') et pages légales de base (mentions légales / politique de confidentialité)</w:t>
       </w:r>
     </w:p>
     <w:p>
@@ -549,7 +561,7 @@
         <w:rPr>
           <w:sz w:val="18"/>
         </w:rPr>
-        <w:t>• Optimisation raisonnable des images (WebP) et des performances de chargement</w:t>
+        <w:t>• Optimisation des performances : compression WebP des visuels haute définition et mise en cache CDN</w:t>
       </w:r>
     </w:p>
     <w:p>
@@ -561,7 +573,7 @@
         <w:rPr>
           <w:sz w:val="18"/>
         </w:rPr>
-        <w:t>• Formation à la livraison pour l'ajout autonome de vêtements et projets</w:t>
+        <w:t>• Formation à la livraison pour l'utilisation et l'ajout autonome de vêtements et projets</w:t>
       </w:r>
     </w:p>
     <w:p>
@@ -585,7 +597,7 @@
         <w:rPr>
           <w:sz w:val="18"/>
         </w:rPr>
-        <w:t>• 1 proposition de direction artistique (maquette de la Home + 1 fiche vêtement)</w:t>
+        <w:t>• 1 proposition de direction artistique (maquette complète validée)</w:t>
       </w:r>
     </w:p>
     <w:p>
@@ -659,7 +671,7 @@
         <w:rPr>
           <w:sz w:val="18"/>
         </w:rPr>
-        <w:t>• Espace professionnels, CRM, gestion des dépôts, contrats - évolutions possibles ultérieurement</w:t>
+        <w:t>• Espace professionnels complexe, CRM externe, gestion des dépôts physiques, contrats légaux - évolutions possibles ultérieurement</w:t>
       </w:r>
     </w:p>
     <w:p>
@@ -717,7 +729,7 @@
         <w:spacing w:after="120" w:line="276" w:lineRule="auto"/>
       </w:pPr>
       <w:r>
-        <w:t>Le tarif ci-dessous inclut la structure technique bilingue (routing, sélecteur de langue, gestion des contenus dans les deux langues). La saisie des traductions elle-même reste à la charge de HAUSMAN, sauf demande contraire.</w:t>
+        <w:t>Le tarif ci-dessous inclut la structure technique bilingue (routing, sélecteur de langue discret FR | EN, gestion des contenus dans les deux langues). La saisie des traductions elle-même reste à la charge de HAUSMAN, sauf demande contraire.</w:t>
       </w:r>
     </w:p>
     <w:tbl>
@@ -857,7 +869,7 @@
         <w:spacing w:after="120" w:line="276" w:lineRule="auto"/>
       </w:pPr>
       <w:r>
-        <w:t>Ces coûts sont payés directement par HAUSMAN auprès d'OVH - ils ne sont pas facturés par le développeur, et le compte est créé au nom de HAUSMAN dès le départ.</w:t>
+        <w:t>Ces coûts sont payés directement par HAUSMAN auprès du registrar et de l'hébergeur - ils ne sont pas facturés par le développeur, et les comptes sont créés au nom de HAUSMAN dès le départ.</w:t>
       </w:r>
     </w:p>
     <w:tbl>
@@ -1085,7 +1097,7 @@
               <w:rPr>
                 <w:sz w:val="18"/>
               </w:rPr>
-              <w:t>Nom de domaine (OVH)</w:t>
+              <w:t>Nom de domaine (OVH / Gandi)</w:t>
             </w:r>
           </w:p>
         </w:tc>
@@ -1104,7 +1116,7 @@
               <w:rPr>
                 <w:sz w:val="18"/>
               </w:rPr>
-              <w:t>Ex. hausman.com</w:t>
+              <w:t>Ex. hausman-paris.com</w:t>
             </w:r>
           </w:p>
         </w:tc>
@@ -1147,7 +1159,7 @@
               <w:rPr>
                 <w:sz w:val="18"/>
               </w:rPr>
-              <w:t>Certificat SSL</w:t>
+              <w:t>Certificat SSL (HTTPS)</w:t>
             </w:r>
           </w:p>
         </w:tc>
@@ -1166,7 +1178,7 @@
               <w:rPr>
                 <w:sz w:val="18"/>
               </w:rPr>
-              <w:t>Généralement inclus chez OVH</w:t>
+              <w:t>Inclus automatiquement chez OVH / Let's Encrypt</w:t>
             </w:r>
           </w:p>
         </w:tc>
@@ -1203,7 +1215,7 @@
           <w:i/>
           <w:sz w:val="17"/>
         </w:rPr>
-        <w:t>L'offre mutualisée OVH est suffisante pour démarrer. Un passage en VPS ne sera nécessaire qu'en cas de trafic ou de volume de photos important - HAUSMAN en sera informé avant tout changement d'offre.</w:t>
+        <w:t>L'offre mutualisée OVH est suffisante pour démarrer. Un passage en VPS ne sera nécessaire qu'en cas de trafic ou de volume de photos très important - HAUSMAN en sera informé avant tout changement d'offre.</w:t>
       </w:r>
     </w:p>
     <w:p>
@@ -1264,7 +1276,7 @@
               </w:rPr>
               <w:t>Développement complet du site HAUSMAN</w:t>
               <w:br/>
-              <w:t>(V1) périmètre décrit en section 3</w:t>
+              <w:t>(V1) périmètre décrit en section 3 (conforme aux 42 sections)</w:t>
             </w:r>
           </w:p>
         </w:tc>

</xml_diff>